<commit_message>
Snippet and Quiz views harmonised with swipe and drag
</commit_message>
<xml_diff>
--- a/To Do.docx
+++ b/To Do.docx
@@ -1452,6 +1452,109 @@
         </w:drawing>
       </w:r>
     </w:p>
+    <w:p>
+      <w:pPr>
+        <w:pStyle w:val="Heading1"/>
+      </w:pPr>
+      <w:r>
+        <w:t xml:space="preserve">Discover Page — Tag Cloud Redesign (Option A: Uniform Chips + Count Badges)</w:t>
+      </w:r>
+    </w:p>
+    <w:p>
+      <w:r>
+        <w:t xml:space="preserve">Replace the multi-size tag word cloud on the Discover page with uniform chips. One font size everywhere; popularity is shown by a small count badge inside each chip instead of font size.</w:t>
+      </w:r>
+    </w:p>
+    <w:p>
+      <w:pPr>
+        <w:pStyle w:val="ListParagraph"/>
+        <w:numPr>
+          <w:ilvl w:val="0"/>
+          <w:numId w:val="1"/>
+        </w:numPr>
+      </w:pPr>
+      <w:r>
+        <w:rPr>
+          <w:b/>
+        </w:rPr>
+        <w:t xml:space="preserve">Tags: </w:t>
+      </w:r>
+      <w:r>
+        <w:t xml:space="preserve">white pill chips (1px border) with the tag name plus a small grey count badge. Top tags (count ≥ 20) get a subtle saffron tint on background and border.</w:t>
+      </w:r>
+    </w:p>
+    <w:p>
+      <w:pPr>
+        <w:pStyle w:val="ListParagraph"/>
+        <w:numPr>
+          <w:ilvl w:val="0"/>
+          <w:numId w:val="1"/>
+        </w:numPr>
+      </w:pPr>
+      <w:r>
+        <w:rPr>
+          <w:b/>
+        </w:rPr>
+        <w:t xml:space="preserve">Categories: </w:t>
+      </w:r>
+      <w:r>
+        <w:t xml:space="preserve">keep the existing pill style, add the same count badges.</w:t>
+      </w:r>
+    </w:p>
+    <w:p>
+      <w:pPr>
+        <w:pStyle w:val="ListParagraph"/>
+        <w:numPr>
+          <w:ilvl w:val="0"/>
+          <w:numId w:val="1"/>
+        </w:numPr>
+      </w:pPr>
+      <w:r>
+        <w:rPr>
+          <w:b/>
+        </w:rPr>
+        <w:t xml:space="preserve">Active state: </w:t>
+      </w:r>
+      <w:r>
+        <w:t xml:space="preserve">Heritage Blue fill with white text; the count badge becomes translucent white.</w:t>
+      </w:r>
+    </w:p>
+    <w:p>
+      <w:pPr>
+        <w:pStyle w:val="ListParagraph"/>
+        <w:numPr>
+          <w:ilvl w:val="0"/>
+          <w:numId w:val="1"/>
+        </w:numPr>
+      </w:pPr>
+      <w:r>
+        <w:rPr>
+          <w:b/>
+        </w:rPr>
+        <w:t xml:space="preserve">Typography: </w:t>
+      </w:r>
+      <w:r>
+        <w:t xml:space="preserve">one size for all chips — 0.875rem Nunito Sans 600. No more multi-size, multi-colour cloud.</w:t>
+      </w:r>
+    </w:p>
+    <w:p>
+      <w:pPr>
+        <w:pStyle w:val="ListParagraph"/>
+        <w:numPr>
+          <w:ilvl w:val="0"/>
+          <w:numId w:val="1"/>
+        </w:numPr>
+      </w:pPr>
+      <w:r>
+        <w:rPr>
+          <w:b/>
+        </w:rPr>
+        <w:t xml:space="preserve">Reference: </w:t>
+      </w:r>
+      <w:r>
+        <w:t xml:space="preserve">mockup approved in chat — Discover_Redesign_Options.html, Option A.</w:t>
+      </w:r>
+    </w:p>
     <w:sectPr>
       <w:pgSz w:w="12240" w:h="15840"/>
       <w:pgMar w:top="1440" w:right="1440" w:bottom="1440" w:left="1440" w:header="708" w:footer="708" w:gutter="0"/>
@@ -1501,1122 +1604,114 @@
 </file>
 
 <file path=word/numbering.xml><?xml version="1.0" encoding="utf-8"?>
-<w:numbering xmlns:wpc="http://schemas.microsoft.com/office/word/2010/wordprocessingCanvas" xmlns:cx="http://schemas.microsoft.com/office/drawing/2014/chartex" xmlns:cx1="http://schemas.microsoft.com/office/drawing/2015/9/8/chartex" xmlns:cx2="http://schemas.microsoft.com/office/drawing/2015/10/21/chartex" xmlns:cx3="http://schemas.microsoft.com/office/drawing/2016/5/9/chartex" xmlns:cx4="http://schemas.microsoft.com/office/drawing/2016/5/10/chartex" xmlns:cx5="http://schemas.microsoft.com/office/drawing/2016/5/11/chartex" xmlns:cx6="http://schemas.microsoft.com/office/drawing/2016/5/12/chartex" xmlns:cx7="http://schemas.microsoft.com/office/drawing/2016/5/13/chartex" xmlns:cx8="http://schemas.microsoft.com/office/drawing/2016/5/14/chartex" xmlns:mc="http://schemas.openxmlformats.org/markup-compatibility/2006" xmlns:aink="http://schemas.microsoft.com/office/drawing/2016/ink" xmlns:am3d="http://schemas.microsoft.com/office/drawing/2017/model3d" xmlns:o="urn:schemas-microsoft-com:office:office" xmlns:oel="http://schemas.microsoft.com/office/2019/extlst" xmlns:r="http://schemas.openxmlformats.org/officeDocument/2006/relationships" xmlns:m="http://schemas.openxmlformats.org/officeDocument/2006/math" xmlns:v="urn:schemas-microsoft-com:vml" xmlns:wp14="http://schemas.microsoft.com/office/word/2010/wordprocessingDrawing" xmlns:wp="http://schemas.openxmlformats.org/drawingml/2006/wordprocessingDrawing" xmlns:w10="urn:schemas-microsoft-com:office:word" xmlns:w="http://schemas.openxmlformats.org/wordprocessingml/2006/main" xmlns:w14="http://schemas.microsoft.com/office/word/2010/wordml" xmlns:w15="http://schemas.microsoft.com/office/word/2012/wordml" xmlns:w16cex="http://schemas.microsoft.com/office/word/2018/wordml/cex" xmlns:w16cid="http://schemas.microsoft.com/office/word/2016/wordml/cid" xmlns:w16="http://schemas.microsoft.com/office/word/2018/wordml" xmlns:w16du="http://schemas.microsoft.com/office/word/2023/wordml/word16du" xmlns:w16sdtdh="http://schemas.microsoft.com/office/word/2020/wordml/sdtdatahash" xmlns:w16sdtfl="http://schemas.microsoft.com/office/word/2024/wordml/sdtformatlock" xmlns:w16se="http://schemas.microsoft.com/office/word/2015/wordml/symex" xmlns:wpg="http://schemas.microsoft.com/office/word/2010/wordprocessingGroup" xmlns:wpi="http://schemas.microsoft.com/office/word/2010/wordprocessingInk" xmlns:wne="http://schemas.microsoft.com/office/word/2006/wordml" xmlns:wps="http://schemas.microsoft.com/office/word/2010/wordprocessingShape" mc:Ignorable="w14 w15 w16se w16cid w16 w16cex w16sdtdh w16sdtfl w16du wp14">
-  <w:abstractNum w:abstractNumId="0" w15:restartNumberingAfterBreak="0">
-    <w:nsid w:val="325C3A82"/>
+<w:numbering xmlns:w="http://schemas.openxmlformats.org/wordprocessingml/2006/main">
+  <w:abstractNum w:abstractNumId="0">
     <w:multiLevelType w:val="hybridMultilevel"/>
-    <w:tmpl w:val="8E027F42"/>
-    <w:lvl w:ilvl="0" w:tplc="63C63674">
+    <w:lvl w:ilvl="0">
       <w:start w:val="1"/>
       <w:numFmt w:val="bullet"/>
-      <w:lvlText w:val="●"/>
+      <w:lvlText w:val=""/>
       <w:lvlJc w:val="left"/>
       <w:pPr>
         <w:ind w:left="720" w:hanging="360"/>
       </w:pPr>
+      <w:rPr>
+        <w:rFonts w:ascii="Symbol" w:hAnsi="Symbol" w:hint="default"/>
+      </w:rPr>
     </w:lvl>
-    <w:lvl w:ilvl="1" w:tplc="4BD6A772">
+    <w:lvl w:ilvl="1">
       <w:start w:val="1"/>
       <w:numFmt w:val="bullet"/>
-      <w:lvlText w:val="○"/>
+      <w:lvlText w:val="o"/>
       <w:lvlJc w:val="left"/>
       <w:pPr>
         <w:ind w:left="1440" w:hanging="360"/>
       </w:pPr>
-    </w:lvl>
-    <w:lvl w:ilvl="2" w:tplc="718445EE">
-      <w:start w:val="1"/>
-      <w:numFmt w:val="bullet"/>
-      <w:lvlText w:val="■"/>
-      <w:lvlJc w:val="left"/>
-      <w:pPr>
-        <w:ind w:left="2160" w:hanging="360"/>
-      </w:pPr>
-    </w:lvl>
-    <w:lvl w:ilvl="3" w:tplc="0BE46CF6">
-      <w:start w:val="1"/>
-      <w:numFmt w:val="bullet"/>
-      <w:lvlText w:val="●"/>
-      <w:lvlJc w:val="left"/>
-      <w:pPr>
-        <w:ind w:left="2880" w:hanging="360"/>
-      </w:pPr>
-    </w:lvl>
-    <w:lvl w:ilvl="4" w:tplc="7CC4D1EA">
-      <w:start w:val="1"/>
-      <w:numFmt w:val="bullet"/>
-      <w:lvlText w:val="○"/>
-      <w:lvlJc w:val="left"/>
-      <w:pPr>
-        <w:ind w:left="3600" w:hanging="360"/>
-      </w:pPr>
-    </w:lvl>
-    <w:lvl w:ilvl="5" w:tplc="7348048C">
-      <w:start w:val="1"/>
-      <w:numFmt w:val="bullet"/>
-      <w:lvlText w:val="■"/>
-      <w:lvlJc w:val="left"/>
-      <w:pPr>
-        <w:ind w:left="4320" w:hanging="360"/>
-      </w:pPr>
-    </w:lvl>
-    <w:lvl w:ilvl="6" w:tplc="B524C11A">
-      <w:start w:val="1"/>
-      <w:numFmt w:val="bullet"/>
-      <w:lvlText w:val="●"/>
-      <w:lvlJc w:val="left"/>
-      <w:pPr>
-        <w:ind w:left="5040" w:hanging="360"/>
-      </w:pPr>
-    </w:lvl>
-    <w:lvl w:ilvl="7" w:tplc="7FFC649E">
-      <w:start w:val="1"/>
-      <w:numFmt w:val="bullet"/>
-      <w:lvlText w:val="●"/>
-      <w:lvlJc w:val="left"/>
-      <w:pPr>
-        <w:ind w:left="5760" w:hanging="360"/>
-      </w:pPr>
-    </w:lvl>
-    <w:lvl w:ilvl="8" w:tplc="83A60616">
-      <w:start w:val="1"/>
-      <w:numFmt w:val="bullet"/>
-      <w:lvlText w:val="●"/>
-      <w:lvlJc w:val="left"/>
-      <w:pPr>
-        <w:ind w:left="6480" w:hanging="360"/>
-      </w:pPr>
+      <w:rPr>
+        <w:rFonts w:ascii="Courier New" w:hAnsi="Courier New" w:hint="default"/>
+      </w:rPr>
     </w:lvl>
   </w:abstractNum>
-  <w:abstractNum w:abstractNumId="1" w15:restartNumberingAfterBreak="0">
-    <w:nsid w:val="48714F25"/>
-    <w:multiLevelType w:val="hybridMultilevel"/>
-    <w:tmpl w:val="29D8BFAC"/>
-    <w:lvl w:ilvl="0" w:tplc="B55CFFFC">
-      <w:start w:val="1"/>
-      <w:numFmt w:val="decimal"/>
-      <w:lvlText w:val="%1."/>
-      <w:lvlJc w:val="left"/>
-      <w:pPr>
-        <w:ind w:left="540" w:hanging="360"/>
-      </w:pPr>
-    </w:lvl>
-    <w:lvl w:ilvl="1" w:tplc="17FA477C">
-      <w:numFmt w:val="decimal"/>
-      <w:lvlText w:val=""/>
-      <w:lvlJc w:val="left"/>
-    </w:lvl>
-    <w:lvl w:ilvl="2" w:tplc="BC3004CC">
-      <w:numFmt w:val="decimal"/>
-      <w:lvlText w:val=""/>
-      <w:lvlJc w:val="left"/>
-    </w:lvl>
-    <w:lvl w:ilvl="3" w:tplc="6588B088">
-      <w:numFmt w:val="decimal"/>
-      <w:lvlText w:val=""/>
-      <w:lvlJc w:val="left"/>
-    </w:lvl>
-    <w:lvl w:ilvl="4" w:tplc="C95EA522">
-      <w:numFmt w:val="decimal"/>
-      <w:lvlText w:val=""/>
-      <w:lvlJc w:val="left"/>
-    </w:lvl>
-    <w:lvl w:ilvl="5" w:tplc="A5E48576">
-      <w:numFmt w:val="decimal"/>
-      <w:lvlText w:val=""/>
-      <w:lvlJc w:val="left"/>
-    </w:lvl>
-    <w:lvl w:ilvl="6" w:tplc="6BE6CE98">
-      <w:numFmt w:val="decimal"/>
-      <w:lvlText w:val=""/>
-      <w:lvlJc w:val="left"/>
-    </w:lvl>
-    <w:lvl w:ilvl="7" w:tplc="134A65B8">
-      <w:numFmt w:val="decimal"/>
-      <w:lvlText w:val=""/>
-      <w:lvlJc w:val="left"/>
-    </w:lvl>
-    <w:lvl w:ilvl="8" w:tplc="CA0E3766">
-      <w:numFmt w:val="decimal"/>
-      <w:lvlText w:val=""/>
-      <w:lvlJc w:val="left"/>
-    </w:lvl>
-  </w:abstractNum>
-  <w:num w:numId="1" w16cid:durableId="1890262992">
+  <w:num w:numId="1">
     <w:abstractNumId w:val="0"/>
-    <w:lvlOverride w:ilvl="0">
-      <w:startOverride w:val="1"/>
-    </w:lvlOverride>
   </w:num>
-  <w:num w:numId="2" w16cid:durableId="128714147">
-    <w:abstractNumId w:val="1"/>
-    <w:lvlOverride w:ilvl="0">
-      <w:startOverride w:val="1"/>
-    </w:lvlOverride>
+  <w:num w:numId="2">
+    <w:abstractNumId w:val="0"/>
   </w:num>
 </w:numbering>
 </file>
 
 <file path=word/styles.xml><?xml version="1.0" encoding="utf-8"?>
-<w:styles xmlns:mc="http://schemas.openxmlformats.org/markup-compatibility/2006" xmlns:r="http://schemas.openxmlformats.org/officeDocument/2006/relationships" xmlns:w="http://schemas.openxmlformats.org/wordprocessingml/2006/main" xmlns:w14="http://schemas.microsoft.com/office/word/2010/wordml" xmlns:w15="http://schemas.microsoft.com/office/word/2012/wordml" xmlns:w16cex="http://schemas.microsoft.com/office/word/2018/wordml/cex" xmlns:w16cid="http://schemas.microsoft.com/office/word/2016/wordml/cid" xmlns:w16="http://schemas.microsoft.com/office/word/2018/wordml" xmlns:w16du="http://schemas.microsoft.com/office/word/2023/wordml/word16du" xmlns:w16sdtdh="http://schemas.microsoft.com/office/word/2020/wordml/sdtdatahash" xmlns:w16sdtfl="http://schemas.microsoft.com/office/word/2024/wordml/sdtformatlock" xmlns:w16se="http://schemas.microsoft.com/office/word/2015/wordml/symex" mc:Ignorable="w14 w15 w16se w16cid w16 w16cex w16sdtdh w16sdtfl w16du">
+<w:styles xmlns:w="http://schemas.openxmlformats.org/wordprocessingml/2006/main">
   <w:docDefaults>
     <w:rPrDefault>
       <w:rPr>
-        <w:rFonts w:ascii="Arial" w:eastAsia="Arial" w:hAnsi="Arial" w:cs="Arial"/>
-        <w:color w:val="101828"/>
+        <w:rFonts w:ascii="Calibri" w:hAnsi="Calibri" w:cs="Calibri"/>
         <w:sz w:val="22"/>
         <w:szCs w:val="22"/>
-        <w:lang w:val="en-IN" w:eastAsia="en-IN" w:bidi="ta-IN"/>
       </w:rPr>
     </w:rPrDefault>
-    <w:pPrDefault/>
+    <w:pPrDefault>
+      <w:pPr>
+        <w:spacing w:after="160" w:line="259" w:lineRule="auto"/>
+      </w:pPr>
+    </w:pPrDefault>
   </w:docDefaults>
-  <w:latentStyles w:defLockedState="0" w:defUIPriority="99" w:defSemiHidden="0" w:defUnhideWhenUsed="0" w:defQFormat="0" w:count="376">
-    <w:lsdException w:name="Normal" w:uiPriority="0" w:qFormat="1"/>
-    <w:lsdException w:name="heading 1" w:uiPriority="9" w:qFormat="1"/>
-    <w:lsdException w:name="heading 2" w:semiHidden="1" w:uiPriority="9" w:unhideWhenUsed="1" w:qFormat="1"/>
-    <w:lsdException w:name="heading 3" w:semiHidden="1" w:uiPriority="9" w:unhideWhenUsed="1" w:qFormat="1"/>
-    <w:lsdException w:name="heading 4" w:semiHidden="1" w:uiPriority="9" w:unhideWhenUsed="1" w:qFormat="1"/>
-    <w:lsdException w:name="heading 5" w:semiHidden="1" w:uiPriority="9" w:unhideWhenUsed="1" w:qFormat="1"/>
-    <w:lsdException w:name="heading 6" w:semiHidden="1" w:uiPriority="9" w:unhideWhenUsed="1" w:qFormat="1"/>
-    <w:lsdException w:name="heading 7" w:semiHidden="1" w:uiPriority="9" w:unhideWhenUsed="1" w:qFormat="1"/>
-    <w:lsdException w:name="heading 8" w:semiHidden="1" w:uiPriority="9" w:unhideWhenUsed="1" w:qFormat="1"/>
-    <w:lsdException w:name="heading 9" w:semiHidden="1" w:uiPriority="9" w:unhideWhenUsed="1" w:qFormat="1"/>
-    <w:lsdException w:name="index 1" w:semiHidden="1" w:unhideWhenUsed="1"/>
-    <w:lsdException w:name="index 2" w:semiHidden="1" w:unhideWhenUsed="1"/>
-    <w:lsdException w:name="index 3" w:semiHidden="1" w:unhideWhenUsed="1"/>
-    <w:lsdException w:name="index 4" w:semiHidden="1" w:unhideWhenUsed="1"/>
-    <w:lsdException w:name="index 5" w:semiHidden="1" w:unhideWhenUsed="1"/>
-    <w:lsdException w:name="index 6" w:semiHidden="1" w:unhideWhenUsed="1"/>
-    <w:lsdException w:name="index 7" w:semiHidden="1" w:unhideWhenUsed="1"/>
-    <w:lsdException w:name="index 8" w:semiHidden="1" w:unhideWhenUsed="1"/>
-    <w:lsdException w:name="index 9" w:semiHidden="1" w:unhideWhenUsed="1"/>
-    <w:lsdException w:name="toc 1" w:semiHidden="1" w:uiPriority="39" w:unhideWhenUsed="1"/>
-    <w:lsdException w:name="toc 2" w:semiHidden="1" w:uiPriority="39" w:unhideWhenUsed="1"/>
-    <w:lsdException w:name="toc 3" w:semiHidden="1" w:uiPriority="39" w:unhideWhenUsed="1"/>
-    <w:lsdException w:name="toc 4" w:semiHidden="1" w:uiPriority="39" w:unhideWhenUsed="1"/>
-    <w:lsdException w:name="toc 5" w:semiHidden="1" w:uiPriority="39" w:unhideWhenUsed="1"/>
-    <w:lsdException w:name="toc 6" w:semiHidden="1" w:uiPriority="39" w:unhideWhenUsed="1"/>
-    <w:lsdException w:name="toc 7" w:semiHidden="1" w:uiPriority="39" w:unhideWhenUsed="1"/>
-    <w:lsdException w:name="toc 8" w:semiHidden="1" w:uiPriority="39" w:unhideWhenUsed="1"/>
-    <w:lsdException w:name="toc 9" w:semiHidden="1" w:uiPriority="39" w:unhideWhenUsed="1"/>
-    <w:lsdException w:name="Normal Indent" w:semiHidden="1" w:unhideWhenUsed="1"/>
-    <w:lsdException w:name="footnote text" w:semiHidden="1" w:unhideWhenUsed="1"/>
-    <w:lsdException w:name="annotation text" w:semiHidden="1" w:unhideWhenUsed="1"/>
-    <w:lsdException w:name="header" w:semiHidden="1" w:unhideWhenUsed="1"/>
-    <w:lsdException w:name="footer" w:semiHidden="1" w:unhideWhenUsed="1"/>
-    <w:lsdException w:name="index heading" w:semiHidden="1" w:unhideWhenUsed="1"/>
-    <w:lsdException w:name="caption" w:semiHidden="1" w:uiPriority="35" w:unhideWhenUsed="1" w:qFormat="1"/>
-    <w:lsdException w:name="table of figures" w:semiHidden="1" w:unhideWhenUsed="1"/>
-    <w:lsdException w:name="envelope address" w:semiHidden="1" w:unhideWhenUsed="1"/>
-    <w:lsdException w:name="envelope return" w:semiHidden="1" w:unhideWhenUsed="1"/>
-    <w:lsdException w:name="footnote reference" w:semiHidden="1" w:unhideWhenUsed="1"/>
-    <w:lsdException w:name="annotation reference" w:semiHidden="1" w:unhideWhenUsed="1"/>
-    <w:lsdException w:name="line number" w:semiHidden="1" w:unhideWhenUsed="1"/>
-    <w:lsdException w:name="page number" w:semiHidden="1" w:unhideWhenUsed="1"/>
-    <w:lsdException w:name="endnote reference" w:semiHidden="1" w:unhideWhenUsed="1"/>
-    <w:lsdException w:name="endnote text" w:semiHidden="1" w:unhideWhenUsed="1"/>
-    <w:lsdException w:name="table of authorities" w:semiHidden="1" w:unhideWhenUsed="1"/>
-    <w:lsdException w:name="macro" w:semiHidden="1" w:unhideWhenUsed="1"/>
-    <w:lsdException w:name="toa heading" w:semiHidden="1" w:unhideWhenUsed="1"/>
-    <w:lsdException w:name="List" w:semiHidden="1" w:unhideWhenUsed="1"/>
-    <w:lsdException w:name="List Bullet" w:semiHidden="1" w:unhideWhenUsed="1"/>
-    <w:lsdException w:name="List Number" w:semiHidden="1" w:unhideWhenUsed="1"/>
-    <w:lsdException w:name="List 2" w:semiHidden="1" w:unhideWhenUsed="1"/>
-    <w:lsdException w:name="List 3" w:semiHidden="1" w:unhideWhenUsed="1"/>
-    <w:lsdException w:name="List 4" w:semiHidden="1" w:unhideWhenUsed="1"/>
-    <w:lsdException w:name="List 5" w:semiHidden="1" w:unhideWhenUsed="1"/>
-    <w:lsdException w:name="List Bullet 2" w:semiHidden="1" w:unhideWhenUsed="1"/>
-    <w:lsdException w:name="List Bullet 3" w:semiHidden="1" w:unhideWhenUsed="1"/>
-    <w:lsdException w:name="List Bullet 4" w:semiHidden="1" w:unhideWhenUsed="1"/>
-    <w:lsdException w:name="List Bullet 5" w:semiHidden="1" w:unhideWhenUsed="1"/>
-    <w:lsdException w:name="List Number 2" w:semiHidden="1" w:unhideWhenUsed="1"/>
-    <w:lsdException w:name="List Number 3" w:semiHidden="1" w:unhideWhenUsed="1"/>
-    <w:lsdException w:name="List Number 4" w:semiHidden="1" w:unhideWhenUsed="1"/>
-    <w:lsdException w:name="List Number 5" w:semiHidden="1" w:unhideWhenUsed="1"/>
-    <w:lsdException w:name="Title" w:uiPriority="10" w:qFormat="1"/>
-    <w:lsdException w:name="Closing" w:semiHidden="1" w:unhideWhenUsed="1"/>
-    <w:lsdException w:name="Signature" w:semiHidden="1" w:unhideWhenUsed="1"/>
-    <w:lsdException w:name="Default Paragraph Font" w:semiHidden="1" w:uiPriority="1" w:unhideWhenUsed="1"/>
-    <w:lsdException w:name="Body Text" w:semiHidden="1" w:unhideWhenUsed="1"/>
-    <w:lsdException w:name="Body Text Indent" w:semiHidden="1" w:unhideWhenUsed="1"/>
-    <w:lsdException w:name="List Continue" w:semiHidden="1" w:unhideWhenUsed="1"/>
-    <w:lsdException w:name="List Continue 2" w:semiHidden="1" w:unhideWhenUsed="1"/>
-    <w:lsdException w:name="List Continue 3" w:semiHidden="1" w:unhideWhenUsed="1"/>
-    <w:lsdException w:name="List Continue 4" w:semiHidden="1" w:unhideWhenUsed="1"/>
-    <w:lsdException w:name="List Continue 5" w:semiHidden="1" w:unhideWhenUsed="1"/>
-    <w:lsdException w:name="Message Header" w:semiHidden="1" w:unhideWhenUsed="1"/>
-    <w:lsdException w:name="Subtitle" w:uiPriority="11" w:qFormat="1"/>
-    <w:lsdException w:name="Salutation" w:semiHidden="1" w:unhideWhenUsed="1"/>
-    <w:lsdException w:name="Date" w:semiHidden="1" w:unhideWhenUsed="1"/>
-    <w:lsdException w:name="Body Text First Indent" w:semiHidden="1" w:unhideWhenUsed="1"/>
-    <w:lsdException w:name="Body Text First Indent 2" w:semiHidden="1" w:unhideWhenUsed="1"/>
-    <w:lsdException w:name="Note Heading" w:semiHidden="1" w:unhideWhenUsed="1"/>
-    <w:lsdException w:name="Body Text 2" w:semiHidden="1" w:unhideWhenUsed="1"/>
-    <w:lsdException w:name="Body Text 3" w:semiHidden="1" w:unhideWhenUsed="1"/>
-    <w:lsdException w:name="Body Text Indent 2" w:semiHidden="1" w:unhideWhenUsed="1"/>
-    <w:lsdException w:name="Body Text Indent 3" w:semiHidden="1" w:unhideWhenUsed="1"/>
-    <w:lsdException w:name="Block Text" w:semiHidden="1" w:unhideWhenUsed="1"/>
-    <w:lsdException w:name="Hyperlink" w:semiHidden="1" w:unhideWhenUsed="1"/>
-    <w:lsdException w:name="FollowedHyperlink" w:semiHidden="1" w:unhideWhenUsed="1"/>
-    <w:lsdException w:name="Strong" w:uiPriority="22" w:qFormat="1"/>
-    <w:lsdException w:name="Emphasis" w:uiPriority="20" w:qFormat="1"/>
-    <w:lsdException w:name="Document Map" w:semiHidden="1" w:unhideWhenUsed="1"/>
-    <w:lsdException w:name="Plain Text" w:semiHidden="1" w:unhideWhenUsed="1"/>
-    <w:lsdException w:name="E-mail Signature" w:semiHidden="1" w:unhideWhenUsed="1"/>
-    <w:lsdException w:name="HTML Top of Form" w:semiHidden="1" w:unhideWhenUsed="1"/>
-    <w:lsdException w:name="HTML Bottom of Form" w:semiHidden="1" w:unhideWhenUsed="1"/>
-    <w:lsdException w:name="Normal (Web)" w:semiHidden="1" w:unhideWhenUsed="1"/>
-    <w:lsdException w:name="HTML Acronym" w:semiHidden="1" w:unhideWhenUsed="1"/>
-    <w:lsdException w:name="HTML Address" w:semiHidden="1" w:unhideWhenUsed="1"/>
-    <w:lsdException w:name="HTML Cite" w:semiHidden="1" w:unhideWhenUsed="1"/>
-    <w:lsdException w:name="HTML Code" w:semiHidden="1" w:unhideWhenUsed="1"/>
-    <w:lsdException w:name="HTML Definition" w:semiHidden="1" w:unhideWhenUsed="1"/>
-    <w:lsdException w:name="HTML Keyboard" w:semiHidden="1" w:unhideWhenUsed="1"/>
-    <w:lsdException w:name="HTML Preformatted" w:semiHidden="1" w:unhideWhenUsed="1"/>
-    <w:lsdException w:name="HTML Sample" w:semiHidden="1" w:unhideWhenUsed="1"/>
-    <w:lsdException w:name="HTML Typewriter" w:semiHidden="1" w:unhideWhenUsed="1"/>
-    <w:lsdException w:name="HTML Variable" w:semiHidden="1" w:unhideWhenUsed="1"/>
-    <w:lsdException w:name="Normal Table" w:semiHidden="1" w:unhideWhenUsed="1"/>
-    <w:lsdException w:name="annotation subject" w:semiHidden="1" w:unhideWhenUsed="1"/>
-    <w:lsdException w:name="No List" w:semiHidden="1" w:unhideWhenUsed="1"/>
-    <w:lsdException w:name="Outline List 1" w:semiHidden="1" w:unhideWhenUsed="1"/>
-    <w:lsdException w:name="Outline List 2" w:semiHidden="1" w:unhideWhenUsed="1"/>
-    <w:lsdException w:name="Outline List 3" w:semiHidden="1" w:unhideWhenUsed="1"/>
-    <w:lsdException w:name="Table Simple 1" w:semiHidden="1" w:unhideWhenUsed="1"/>
-    <w:lsdException w:name="Table Simple 2" w:semiHidden="1" w:unhideWhenUsed="1"/>
-    <w:lsdException w:name="Table Simple 3" w:semiHidden="1" w:unhideWhenUsed="1"/>
-    <w:lsdException w:name="Table Classic 1" w:semiHidden="1" w:unhideWhenUsed="1"/>
-    <w:lsdException w:name="Table Classic 2" w:semiHidden="1" w:unhideWhenUsed="1"/>
-    <w:lsdException w:name="Table Classic 3" w:semiHidden="1" w:unhideWhenUsed="1"/>
-    <w:lsdException w:name="Table Classic 4" w:semiHidden="1" w:unhideWhenUsed="1"/>
-    <w:lsdException w:name="Table Colorful 1" w:semiHidden="1" w:unhideWhenUsed="1"/>
-    <w:lsdException w:name="Table Colorful 2" w:semiHidden="1" w:unhideWhenUsed="1"/>
-    <w:lsdException w:name="Table Colorful 3" w:semiHidden="1" w:unhideWhenUsed="1"/>
-    <w:lsdException w:name="Table Columns 1" w:semiHidden="1" w:unhideWhenUsed="1"/>
-    <w:lsdException w:name="Table Columns 2" w:semiHidden="1" w:unhideWhenUsed="1"/>
-    <w:lsdException w:name="Table Columns 3" w:semiHidden="1" w:unhideWhenUsed="1"/>
-    <w:lsdException w:name="Table Columns 4" w:semiHidden="1" w:unhideWhenUsed="1"/>
-    <w:lsdException w:name="Table Columns 5" w:semiHidden="1" w:unhideWhenUsed="1"/>
-    <w:lsdException w:name="Table Grid 1" w:semiHidden="1" w:unhideWhenUsed="1"/>
-    <w:lsdException w:name="Table Grid 2" w:semiHidden="1" w:unhideWhenUsed="1"/>
-    <w:lsdException w:name="Table Grid 3" w:semiHidden="1" w:unhideWhenUsed="1"/>
-    <w:lsdException w:name="Table Grid 4" w:semiHidden="1" w:unhideWhenUsed="1"/>
-    <w:lsdException w:name="Table Grid 5" w:semiHidden="1" w:unhideWhenUsed="1"/>
-    <w:lsdException w:name="Table Grid 6" w:semiHidden="1" w:unhideWhenUsed="1"/>
-    <w:lsdException w:name="Table Grid 7" w:semiHidden="1" w:unhideWhenUsed="1"/>
-    <w:lsdException w:name="Table Grid 8" w:semiHidden="1" w:unhideWhenUsed="1"/>
-    <w:lsdException w:name="Table List 1" w:semiHidden="1" w:unhideWhenUsed="1"/>
-    <w:lsdException w:name="Table List 2" w:semiHidden="1" w:unhideWhenUsed="1"/>
-    <w:lsdException w:name="Table List 3" w:semiHidden="1" w:unhideWhenUsed="1"/>
-    <w:lsdException w:name="Table List 4" w:semiHidden="1" w:unhideWhenUsed="1"/>
-    <w:lsdException w:name="Table List 5" w:semiHidden="1" w:unhideWhenUsed="1"/>
-    <w:lsdException w:name="Table List 6" w:semiHidden="1" w:unhideWhenUsed="1"/>
-    <w:lsdException w:name="Table List 7" w:semiHidden="1" w:unhideWhenUsed="1"/>
-    <w:lsdException w:name="Table List 8" w:semiHidden="1" w:unhideWhenUsed="1"/>
-    <w:lsdException w:name="Table 3D effects 1" w:semiHidden="1" w:unhideWhenUsed="1"/>
-    <w:lsdException w:name="Table 3D effects 2" w:semiHidden="1" w:unhideWhenUsed="1"/>
-    <w:lsdException w:name="Table 3D effects 3" w:semiHidden="1" w:unhideWhenUsed="1"/>
-    <w:lsdException w:name="Table Contemporary" w:semiHidden="1" w:unhideWhenUsed="1"/>
-    <w:lsdException w:name="Table Elegant" w:semiHidden="1" w:unhideWhenUsed="1"/>
-    <w:lsdException w:name="Table Professional" w:semiHidden="1" w:unhideWhenUsed="1"/>
-    <w:lsdException w:name="Table Subtle 1" w:semiHidden="1" w:unhideWhenUsed="1"/>
-    <w:lsdException w:name="Table Subtle 2" w:semiHidden="1" w:unhideWhenUsed="1"/>
-    <w:lsdException w:name="Table Web 1" w:semiHidden="1" w:unhideWhenUsed="1"/>
-    <w:lsdException w:name="Table Web 2" w:semiHidden="1" w:unhideWhenUsed="1"/>
-    <w:lsdException w:name="Table Web 3" w:semiHidden="1" w:unhideWhenUsed="1"/>
-    <w:lsdException w:name="Balloon Text" w:semiHidden="1" w:unhideWhenUsed="1"/>
-    <w:lsdException w:name="Table Grid" w:uiPriority="39"/>
-    <w:lsdException w:name="Table Theme" w:semiHidden="1" w:unhideWhenUsed="1"/>
-    <w:lsdException w:name="Placeholder Text" w:semiHidden="1"/>
-    <w:lsdException w:name="No Spacing" w:uiPriority="1" w:qFormat="1"/>
-    <w:lsdException w:name="Light Shading" w:uiPriority="60"/>
-    <w:lsdException w:name="Light List" w:uiPriority="61"/>
-    <w:lsdException w:name="Light Grid" w:uiPriority="62"/>
-    <w:lsdException w:name="Medium Shading 1" w:uiPriority="63"/>
-    <w:lsdException w:name="Medium Shading 2" w:uiPriority="64"/>
-    <w:lsdException w:name="Medium List 1" w:uiPriority="65"/>
-    <w:lsdException w:name="Medium List 2" w:uiPriority="66"/>
-    <w:lsdException w:name="Medium Grid 1" w:uiPriority="67"/>
-    <w:lsdException w:name="Medium Grid 2" w:uiPriority="68"/>
-    <w:lsdException w:name="Medium Grid 3" w:uiPriority="69"/>
-    <w:lsdException w:name="Dark List" w:uiPriority="70"/>
-    <w:lsdException w:name="Colorful Shading" w:uiPriority="71"/>
-    <w:lsdException w:name="Colorful List" w:uiPriority="72"/>
-    <w:lsdException w:name="Colorful Grid" w:uiPriority="73"/>
-    <w:lsdException w:name="Light Shading Accent 1" w:uiPriority="60"/>
-    <w:lsdException w:name="Light List Accent 1" w:uiPriority="61"/>
-    <w:lsdException w:name="Light Grid Accent 1" w:uiPriority="62"/>
-    <w:lsdException w:name="Medium Shading 1 Accent 1" w:uiPriority="63"/>
-    <w:lsdException w:name="Medium Shading 2 Accent 1" w:uiPriority="64"/>
-    <w:lsdException w:name="Medium List 1 Accent 1" w:uiPriority="65"/>
-    <w:lsdException w:name="Revision" w:semiHidden="1"/>
-    <w:lsdException w:name="List Paragraph" w:uiPriority="34" w:qFormat="1"/>
-    <w:lsdException w:name="Quote" w:uiPriority="29" w:qFormat="1"/>
-    <w:lsdException w:name="Intense Quote" w:uiPriority="30" w:qFormat="1"/>
-    <w:lsdException w:name="Medium List 2 Accent 1" w:uiPriority="66"/>
-    <w:lsdException w:name="Medium Grid 1 Accent 1" w:uiPriority="67"/>
-    <w:lsdException w:name="Medium Grid 2 Accent 1" w:uiPriority="68"/>
-    <w:lsdException w:name="Medium Grid 3 Accent 1" w:uiPriority="69"/>
-    <w:lsdException w:name="Dark List Accent 1" w:uiPriority="70"/>
-    <w:lsdException w:name="Colorful Shading Accent 1" w:uiPriority="71"/>
-    <w:lsdException w:name="Colorful List Accent 1" w:uiPriority="72"/>
-    <w:lsdException w:name="Colorful Grid Accent 1" w:uiPriority="73"/>
-    <w:lsdException w:name="Light Shading Accent 2" w:uiPriority="60"/>
-    <w:lsdException w:name="Light List Accent 2" w:uiPriority="61"/>
-    <w:lsdException w:name="Light Grid Accent 2" w:uiPriority="62"/>
-    <w:lsdException w:name="Medium Shading 1 Accent 2" w:uiPriority="63"/>
-    <w:lsdException w:name="Medium Shading 2 Accent 2" w:uiPriority="64"/>
-    <w:lsdException w:name="Medium List 1 Accent 2" w:uiPriority="65"/>
-    <w:lsdException w:name="Medium List 2 Accent 2" w:uiPriority="66"/>
-    <w:lsdException w:name="Medium Grid 1 Accent 2" w:uiPriority="67"/>
-    <w:lsdException w:name="Medium Grid 2 Accent 2" w:uiPriority="68"/>
-    <w:lsdException w:name="Medium Grid 3 Accent 2" w:uiPriority="69"/>
-    <w:lsdException w:name="Dark List Accent 2" w:uiPriority="70"/>
-    <w:lsdException w:name="Colorful Shading Accent 2" w:uiPriority="71"/>
-    <w:lsdException w:name="Colorful List Accent 2" w:uiPriority="72"/>
-    <w:lsdException w:name="Colorful Grid Accent 2" w:uiPriority="73"/>
-    <w:lsdException w:name="Light Shading Accent 3" w:uiPriority="60"/>
-    <w:lsdException w:name="Light List Accent 3" w:uiPriority="61"/>
-    <w:lsdException w:name="Light Grid Accent 3" w:uiPriority="62"/>
-    <w:lsdException w:name="Medium Shading 1 Accent 3" w:uiPriority="63"/>
-    <w:lsdException w:name="Medium Shading 2 Accent 3" w:uiPriority="64"/>
-    <w:lsdException w:name="Medium List 1 Accent 3" w:uiPriority="65"/>
-    <w:lsdException w:name="Medium List 2 Accent 3" w:uiPriority="66"/>
-    <w:lsdException w:name="Medium Grid 1 Accent 3" w:uiPriority="67"/>
-    <w:lsdException w:name="Medium Grid 2 Accent 3" w:uiPriority="68"/>
-    <w:lsdException w:name="Medium Grid 3 Accent 3" w:uiPriority="69"/>
-    <w:lsdException w:name="Dark List Accent 3" w:uiPriority="70"/>
-    <w:lsdException w:name="Colorful Shading Accent 3" w:uiPriority="71"/>
-    <w:lsdException w:name="Colorful List Accent 3" w:uiPriority="72"/>
-    <w:lsdException w:name="Colorful Grid Accent 3" w:uiPriority="73"/>
-    <w:lsdException w:name="Light Shading Accent 4" w:uiPriority="60"/>
-    <w:lsdException w:name="Light List Accent 4" w:uiPriority="61"/>
-    <w:lsdException w:name="Light Grid Accent 4" w:uiPriority="62"/>
-    <w:lsdException w:name="Medium Shading 1 Accent 4" w:uiPriority="63"/>
-    <w:lsdException w:name="Medium Shading 2 Accent 4" w:uiPriority="64"/>
-    <w:lsdException w:name="Medium List 1 Accent 4" w:uiPriority="65"/>
-    <w:lsdException w:name="Medium List 2 Accent 4" w:uiPriority="66"/>
-    <w:lsdException w:name="Medium Grid 1 Accent 4" w:uiPriority="67"/>
-    <w:lsdException w:name="Medium Grid 2 Accent 4" w:uiPriority="68"/>
-    <w:lsdException w:name="Medium Grid 3 Accent 4" w:uiPriority="69"/>
-    <w:lsdException w:name="Dark List Accent 4" w:uiPriority="70"/>
-    <w:lsdException w:name="Colorful Shading Accent 4" w:uiPriority="71"/>
-    <w:lsdException w:name="Colorful List Accent 4" w:uiPriority="72"/>
-    <w:lsdException w:name="Colorful Grid Accent 4" w:uiPriority="73"/>
-    <w:lsdException w:name="Light Shading Accent 5" w:uiPriority="60"/>
-    <w:lsdException w:name="Light List Accent 5" w:uiPriority="61"/>
-    <w:lsdException w:name="Light Grid Accent 5" w:uiPriority="62"/>
-    <w:lsdException w:name="Medium Shading 1 Accent 5" w:uiPriority="63"/>
-    <w:lsdException w:name="Medium Shading 2 Accent 5" w:uiPriority="64"/>
-    <w:lsdException w:name="Medium List 1 Accent 5" w:uiPriority="65"/>
-    <w:lsdException w:name="Medium List 2 Accent 5" w:uiPriority="66"/>
-    <w:lsdException w:name="Medium Grid 1 Accent 5" w:uiPriority="67"/>
-    <w:lsdException w:name="Medium Grid 2 Accent 5" w:uiPriority="68"/>
-    <w:lsdException w:name="Medium Grid 3 Accent 5" w:uiPriority="69"/>
-    <w:lsdException w:name="Dark List Accent 5" w:uiPriority="70"/>
-    <w:lsdException w:name="Colorful Shading Accent 5" w:uiPriority="71"/>
-    <w:lsdException w:name="Colorful List Accent 5" w:uiPriority="72"/>
-    <w:lsdException w:name="Colorful Grid Accent 5" w:uiPriority="73"/>
-    <w:lsdException w:name="Light Shading Accent 6" w:uiPriority="60"/>
-    <w:lsdException w:name="Light List Accent 6" w:uiPriority="61"/>
-    <w:lsdException w:name="Light Grid Accent 6" w:uiPriority="62"/>
-    <w:lsdException w:name="Medium Shading 1 Accent 6" w:uiPriority="63"/>
-    <w:lsdException w:name="Medium Shading 2 Accent 6" w:uiPriority="64"/>
-    <w:lsdException w:name="Medium List 1 Accent 6" w:uiPriority="65"/>
-    <w:lsdException w:name="Medium List 2 Accent 6" w:uiPriority="66"/>
-    <w:lsdException w:name="Medium Grid 1 Accent 6" w:uiPriority="67"/>
-    <w:lsdException w:name="Medium Grid 2 Accent 6" w:uiPriority="68"/>
-    <w:lsdException w:name="Medium Grid 3 Accent 6" w:uiPriority="69"/>
-    <w:lsdException w:name="Dark List Accent 6" w:uiPriority="70"/>
-    <w:lsdException w:name="Colorful Shading Accent 6" w:uiPriority="71"/>
-    <w:lsdException w:name="Colorful List Accent 6" w:uiPriority="72"/>
-    <w:lsdException w:name="Colorful Grid Accent 6" w:uiPriority="73"/>
-    <w:lsdException w:name="Subtle Emphasis" w:uiPriority="19" w:qFormat="1"/>
-    <w:lsdException w:name="Intense Emphasis" w:uiPriority="21" w:qFormat="1"/>
-    <w:lsdException w:name="Subtle Reference" w:uiPriority="31" w:qFormat="1"/>
-    <w:lsdException w:name="Intense Reference" w:uiPriority="32" w:qFormat="1"/>
-    <w:lsdException w:name="Book Title" w:uiPriority="33" w:qFormat="1"/>
-    <w:lsdException w:name="Bibliography" w:semiHidden="1" w:uiPriority="37" w:unhideWhenUsed="1"/>
-    <w:lsdException w:name="TOC Heading" w:semiHidden="1" w:uiPriority="39" w:unhideWhenUsed="1" w:qFormat="1"/>
-    <w:lsdException w:name="Plain Table 1" w:uiPriority="41"/>
-    <w:lsdException w:name="Plain Table 2" w:uiPriority="42"/>
-    <w:lsdException w:name="Plain Table 3" w:uiPriority="43"/>
-    <w:lsdException w:name="Plain Table 4" w:uiPriority="44"/>
-    <w:lsdException w:name="Plain Table 5" w:uiPriority="45"/>
-    <w:lsdException w:name="Grid Table Light" w:uiPriority="40"/>
-    <w:lsdException w:name="Grid Table 1 Light" w:uiPriority="46"/>
-    <w:lsdException w:name="Grid Table 2" w:uiPriority="47"/>
-    <w:lsdException w:name="Grid Table 3" w:uiPriority="48"/>
-    <w:lsdException w:name="Grid Table 4" w:uiPriority="49"/>
-    <w:lsdException w:name="Grid Table 5 Dark" w:uiPriority="50"/>
-    <w:lsdException w:name="Grid Table 6 Colorful" w:uiPriority="51"/>
-    <w:lsdException w:name="Grid Table 7 Colorful" w:uiPriority="52"/>
-    <w:lsdException w:name="Grid Table 1 Light Accent 1" w:uiPriority="46"/>
-    <w:lsdException w:name="Grid Table 2 Accent 1" w:uiPriority="47"/>
-    <w:lsdException w:name="Grid Table 3 Accent 1" w:uiPriority="48"/>
-    <w:lsdException w:name="Grid Table 4 Accent 1" w:uiPriority="49"/>
-    <w:lsdException w:name="Grid Table 5 Dark Accent 1" w:uiPriority="50"/>
-    <w:lsdException w:name="Grid Table 6 Colorful Accent 1" w:uiPriority="51"/>
-    <w:lsdException w:name="Grid Table 7 Colorful Accent 1" w:uiPriority="52"/>
-    <w:lsdException w:name="Grid Table 1 Light Accent 2" w:uiPriority="46"/>
-    <w:lsdException w:name="Grid Table 2 Accent 2" w:uiPriority="47"/>
-    <w:lsdException w:name="Grid Table 3 Accent 2" w:uiPriority="48"/>
-    <w:lsdException w:name="Grid Table 4 Accent 2" w:uiPriority="49"/>
-    <w:lsdException w:name="Grid Table 5 Dark Accent 2" w:uiPriority="50"/>
-    <w:lsdException w:name="Grid Table 6 Colorful Accent 2" w:uiPriority="51"/>
-    <w:lsdException w:name="Grid Table 7 Colorful Accent 2" w:uiPriority="52"/>
-    <w:lsdException w:name="Grid Table 1 Light Accent 3" w:uiPriority="46"/>
-    <w:lsdException w:name="Grid Table 2 Accent 3" w:uiPriority="47"/>
-    <w:lsdException w:name="Grid Table 3 Accent 3" w:uiPriority="48"/>
-    <w:lsdException w:name="Grid Table 4 Accent 3" w:uiPriority="49"/>
-    <w:lsdException w:name="Grid Table 5 Dark Accent 3" w:uiPriority="50"/>
-    <w:lsdException w:name="Grid Table 6 Colorful Accent 3" w:uiPriority="51"/>
-    <w:lsdException w:name="Grid Table 7 Colorful Accent 3" w:uiPriority="52"/>
-    <w:lsdException w:name="Grid Table 1 Light Accent 4" w:uiPriority="46"/>
-    <w:lsdException w:name="Grid Table 2 Accent 4" w:uiPriority="47"/>
-    <w:lsdException w:name="Grid Table 3 Accent 4" w:uiPriority="48"/>
-    <w:lsdException w:name="Grid Table 4 Accent 4" w:uiPriority="49"/>
-    <w:lsdException w:name="Grid Table 5 Dark Accent 4" w:uiPriority="50"/>
-    <w:lsdException w:name="Grid Table 6 Colorful Accent 4" w:uiPriority="51"/>
-    <w:lsdException w:name="Grid Table 7 Colorful Accent 4" w:uiPriority="52"/>
-    <w:lsdException w:name="Grid Table 1 Light Accent 5" w:uiPriority="46"/>
-    <w:lsdException w:name="Grid Table 2 Accent 5" w:uiPriority="47"/>
-    <w:lsdException w:name="Grid Table 3 Accent 5" w:uiPriority="48"/>
-    <w:lsdException w:name="Grid Table 4 Accent 5" w:uiPriority="49"/>
-    <w:lsdException w:name="Grid Table 5 Dark Accent 5" w:uiPriority="50"/>
-    <w:lsdException w:name="Grid Table 6 Colorful Accent 5" w:uiPriority="51"/>
-    <w:lsdException w:name="Grid Table 7 Colorful Accent 5" w:uiPriority="52"/>
-    <w:lsdException w:name="Grid Table 1 Light Accent 6" w:uiPriority="46"/>
-    <w:lsdException w:name="Grid Table 2 Accent 6" w:uiPriority="47"/>
-    <w:lsdException w:name="Grid Table 3 Accent 6" w:uiPriority="48"/>
-    <w:lsdException w:name="Grid Table 4 Accent 6" w:uiPriority="49"/>
-    <w:lsdException w:name="Grid Table 5 Dark Accent 6" w:uiPriority="50"/>
-    <w:lsdException w:name="Grid Table 6 Colorful Accent 6" w:uiPriority="51"/>
-    <w:lsdException w:name="Grid Table 7 Colorful Accent 6" w:uiPriority="52"/>
-    <w:lsdException w:name="List Table 1 Light" w:uiPriority="46"/>
-    <w:lsdException w:name="List Table 2" w:uiPriority="47"/>
-    <w:lsdException w:name="List Table 3" w:uiPriority="48"/>
-    <w:lsdException w:name="List Table 4" w:uiPriority="49"/>
-    <w:lsdException w:name="List Table 5 Dark" w:uiPriority="50"/>
-    <w:lsdException w:name="List Table 6 Colorful" w:uiPriority="51"/>
-    <w:lsdException w:name="List Table 7 Colorful" w:uiPriority="52"/>
-    <w:lsdException w:name="List Table 1 Light Accent 1" w:uiPriority="46"/>
-    <w:lsdException w:name="List Table 2 Accent 1" w:uiPriority="47"/>
-    <w:lsdException w:name="List Table 3 Accent 1" w:uiPriority="48"/>
-    <w:lsdException w:name="List Table 4 Accent 1" w:uiPriority="49"/>
-    <w:lsdException w:name="List Table 5 Dark Accent 1" w:uiPriority="50"/>
-    <w:lsdException w:name="List Table 6 Colorful Accent 1" w:uiPriority="51"/>
-    <w:lsdException w:name="List Table 7 Colorful Accent 1" w:uiPriority="52"/>
-    <w:lsdException w:name="List Table 1 Light Accent 2" w:uiPriority="46"/>
-    <w:lsdException w:name="List Table 2 Accent 2" w:uiPriority="47"/>
-    <w:lsdException w:name="List Table 3 Accent 2" w:uiPriority="48"/>
-    <w:lsdException w:name="List Table 4 Accent 2" w:uiPriority="49"/>
-    <w:lsdException w:name="List Table 5 Dark Accent 2" w:uiPriority="50"/>
-    <w:lsdException w:name="List Table 6 Colorful Accent 2" w:uiPriority="51"/>
-    <w:lsdException w:name="List Table 7 Colorful Accent 2" w:uiPriority="52"/>
-    <w:lsdException w:name="List Table 1 Light Accent 3" w:uiPriority="46"/>
-    <w:lsdException w:name="List Table 2 Accent 3" w:uiPriority="47"/>
-    <w:lsdException w:name="List Table 3 Accent 3" w:uiPriority="48"/>
-    <w:lsdException w:name="List Table 4 Accent 3" w:uiPriority="49"/>
-    <w:lsdException w:name="List Table 5 Dark Accent 3" w:uiPriority="50"/>
-    <w:lsdException w:name="List Table 6 Colorful Accent 3" w:uiPriority="51"/>
-    <w:lsdException w:name="List Table 7 Colorful Accent 3" w:uiPriority="52"/>
-    <w:lsdException w:name="List Table 1 Light Accent 4" w:uiPriority="46"/>
-    <w:lsdException w:name="List Table 2 Accent 4" w:uiPriority="47"/>
-    <w:lsdException w:name="List Table 3 Accent 4" w:uiPriority="48"/>
-    <w:lsdException w:name="List Table 4 Accent 4" w:uiPriority="49"/>
-    <w:lsdException w:name="List Table 5 Dark Accent 4" w:uiPriority="50"/>
-    <w:lsdException w:name="List Table 6 Colorful Accent 4" w:uiPriority="51"/>
-    <w:lsdException w:name="List Table 7 Colorful Accent 4" w:uiPriority="52"/>
-    <w:lsdException w:name="List Table 1 Light Accent 5" w:uiPriority="46"/>
-    <w:lsdException w:name="List Table 2 Accent 5" w:uiPriority="47"/>
-    <w:lsdException w:name="List Table 3 Accent 5" w:uiPriority="48"/>
-    <w:lsdException w:name="List Table 4 Accent 5" w:uiPriority="49"/>
-    <w:lsdException w:name="List Table 5 Dark Accent 5" w:uiPriority="50"/>
-    <w:lsdException w:name="List Table 6 Colorful Accent 5" w:uiPriority="51"/>
-    <w:lsdException w:name="List Table 7 Colorful Accent 5" w:uiPriority="52"/>
-    <w:lsdException w:name="List Table 1 Light Accent 6" w:uiPriority="46"/>
-    <w:lsdException w:name="List Table 2 Accent 6" w:uiPriority="47"/>
-    <w:lsdException w:name="List Table 3 Accent 6" w:uiPriority="48"/>
-    <w:lsdException w:name="List Table 4 Accent 6" w:uiPriority="49"/>
-    <w:lsdException w:name="List Table 5 Dark Accent 6" w:uiPriority="50"/>
-    <w:lsdException w:name="List Table 6 Colorful Accent 6" w:uiPriority="51"/>
-    <w:lsdException w:name="List Table 7 Colorful Accent 6" w:uiPriority="52"/>
-    <w:lsdException w:name="Mention" w:semiHidden="1" w:unhideWhenUsed="1"/>
-    <w:lsdException w:name="Smart Hyperlink" w:semiHidden="1" w:unhideWhenUsed="1"/>
-    <w:lsdException w:name="Hashtag" w:semiHidden="1" w:unhideWhenUsed="1"/>
-    <w:lsdException w:name="Unresolved Mention" w:semiHidden="1" w:unhideWhenUsed="1"/>
-    <w:lsdException w:name="Smart Link" w:semiHidden="1" w:unhideWhenUsed="1"/>
-  </w:latentStyles>
   <w:style w:type="paragraph" w:default="1" w:styleId="Normal">
     <w:name w:val="Normal"/>
     <w:qFormat/>
   </w:style>
   <w:style w:type="paragraph" w:styleId="Heading1">
     <w:name w:val="heading 1"/>
-    <w:uiPriority w:val="9"/>
+    <w:basedOn w:val="Normal"/>
+    <w:next w:val="Normal"/>
     <w:qFormat/>
     <w:pPr>
-      <w:spacing w:before="240" w:after="200"/>
+      <w:keepNext/>
+      <w:spacing w:before="240" w:after="120"/>
       <w:outlineLvl w:val="0"/>
     </w:pPr>
     <w:rPr>
-      <w:b/>
-      <w:bCs/>
-      <w:color w:val="00509E"/>
+      <w:rFonts w:ascii="Calibri Light" w:hAnsi="Calibri Light"/>
+      <w:color w:val="2F5496"/>
       <w:sz w:val="32"/>
       <w:szCs w:val="32"/>
     </w:rPr>
   </w:style>
   <w:style w:type="paragraph" w:styleId="Heading2">
     <w:name w:val="heading 2"/>
-    <w:uiPriority w:val="9"/>
-    <w:unhideWhenUsed/>
+    <w:basedOn w:val="Normal"/>
+    <w:next w:val="Normal"/>
     <w:qFormat/>
     <w:pPr>
-      <w:spacing w:before="300" w:after="140"/>
+      <w:keepNext/>
+      <w:spacing w:before="200" w:after="100"/>
       <w:outlineLvl w:val="1"/>
     </w:pPr>
     <w:rPr>
-      <w:b/>
-      <w:bCs/>
-      <w:color w:val="00509E"/>
+      <w:rFonts w:ascii="Calibri Light" w:hAnsi="Calibri Light"/>
+      <w:color w:val="2F5496"/>
       <w:sz w:val="26"/>
       <w:szCs w:val="26"/>
     </w:rPr>
   </w:style>
-  <w:style w:type="paragraph" w:styleId="Heading3">
-    <w:name w:val="heading 3"/>
-    <w:uiPriority w:val="9"/>
-    <w:semiHidden/>
-    <w:unhideWhenUsed/>
+  <w:style w:type="paragraph" w:styleId="ListParagraph">
+    <w:name w:val="List Paragraph"/>
+    <w:basedOn w:val="Normal"/>
     <w:qFormat/>
     <w:pPr>
-      <w:outlineLvl w:val="2"/>
+      <w:ind w:left="720"/>
+      <w:contextualSpacing/>
     </w:pPr>
-    <w:rPr>
-      <w:color w:val="1F4D78"/>
-      <w:sz w:val="24"/>
-      <w:szCs w:val="24"/>
-    </w:rPr>
-  </w:style>
-  <w:style w:type="paragraph" w:styleId="Heading4">
-    <w:name w:val="heading 4"/>
-    <w:uiPriority w:val="9"/>
-    <w:semiHidden/>
-    <w:unhideWhenUsed/>
-    <w:qFormat/>
-    <w:pPr>
-      <w:outlineLvl w:val="3"/>
-    </w:pPr>
-    <w:rPr>
-      <w:i/>
-      <w:iCs/>
-      <w:color w:val="2E74B5"/>
-    </w:rPr>
-  </w:style>
-  <w:style w:type="paragraph" w:styleId="Heading5">
-    <w:name w:val="heading 5"/>
-    <w:uiPriority w:val="9"/>
-    <w:semiHidden/>
-    <w:unhideWhenUsed/>
-    <w:qFormat/>
-    <w:pPr>
-      <w:outlineLvl w:val="4"/>
-    </w:pPr>
-    <w:rPr>
-      <w:color w:val="2E74B5"/>
-    </w:rPr>
-  </w:style>
-  <w:style w:type="paragraph" w:styleId="Heading6">
-    <w:name w:val="heading 6"/>
-    <w:uiPriority w:val="9"/>
-    <w:semiHidden/>
-    <w:unhideWhenUsed/>
-    <w:qFormat/>
-    <w:pPr>
-      <w:outlineLvl w:val="5"/>
-    </w:pPr>
-    <w:rPr>
-      <w:color w:val="1F4D78"/>
-    </w:rPr>
   </w:style>
   <w:style w:type="character" w:default="1" w:styleId="DefaultParagraphFont">
     <w:name w:val="Default Paragraph Font"/>
-    <w:uiPriority w:val="1"/>
-    <w:semiHidden/>
-    <w:unhideWhenUsed/>
   </w:style>
   <w:style w:type="table" w:default="1" w:styleId="TableNormal">
     <w:name w:val="Normal Table"/>
-    <w:uiPriority w:val="99"/>
-    <w:semiHidden/>
-    <w:unhideWhenUsed/>
-    <w:tblPr>
-      <w:tblInd w:w="0" w:type="dxa"/>
-      <w:tblCellMar>
-        <w:top w:w="0" w:type="dxa"/>
-        <w:left w:w="108" w:type="dxa"/>
-        <w:bottom w:w="0" w:type="dxa"/>
-        <w:right w:w="108" w:type="dxa"/>
-      </w:tblCellMar>
-    </w:tblPr>
   </w:style>
   <w:style w:type="numbering" w:default="1" w:styleId="NoList">
     <w:name w:val="No List"/>
-    <w:uiPriority w:val="99"/>
-    <w:semiHidden/>
-    <w:unhideWhenUsed/>
-  </w:style>
-  <w:style w:type="paragraph" w:styleId="Title">
-    <w:name w:val="Title"/>
-    <w:uiPriority w:val="10"/>
-    <w:qFormat/>
-    <w:rPr>
-      <w:sz w:val="56"/>
-      <w:szCs w:val="56"/>
-    </w:rPr>
-  </w:style>
-  <w:style w:type="paragraph" w:customStyle="1" w:styleId="Strong1">
-    <w:name w:val="Strong1"/>
-    <w:qFormat/>
-    <w:rPr>
-      <w:b/>
-      <w:bCs/>
-    </w:rPr>
-  </w:style>
-  <w:style w:type="paragraph" w:styleId="ListParagraph">
-    <w:name w:val="List Paragraph"/>
-    <w:qFormat/>
-  </w:style>
-  <w:style w:type="character" w:styleId="Hyperlink">
-    <w:name w:val="Hyperlink"/>
-    <w:uiPriority w:val="99"/>
-    <w:unhideWhenUsed/>
-    <w:rPr>
-      <w:color w:val="0563C1"/>
-      <w:u w:val="single"/>
-    </w:rPr>
-  </w:style>
-  <w:style w:type="character" w:styleId="FootnoteReference">
-    <w:name w:val="footnote reference"/>
-    <w:uiPriority w:val="99"/>
-    <w:semiHidden/>
-    <w:unhideWhenUsed/>
-    <w:rPr>
-      <w:vertAlign w:val="superscript"/>
-    </w:rPr>
-  </w:style>
-  <w:style w:type="paragraph" w:styleId="FootnoteText">
-    <w:name w:val="footnote text"/>
-    <w:link w:val="FootnoteTextChar"/>
-    <w:uiPriority w:val="99"/>
-    <w:semiHidden/>
-    <w:unhideWhenUsed/>
-    <w:rPr>
-      <w:sz w:val="20"/>
-      <w:szCs w:val="20"/>
-    </w:rPr>
-  </w:style>
-  <w:style w:type="character" w:customStyle="1" w:styleId="FootnoteTextChar">
-    <w:name w:val="Footnote Text Char"/>
-    <w:link w:val="FootnoteText"/>
-    <w:uiPriority w:val="99"/>
-    <w:semiHidden/>
-    <w:unhideWhenUsed/>
-    <w:rPr>
-      <w:sz w:val="20"/>
-      <w:szCs w:val="20"/>
-    </w:rPr>
-  </w:style>
-  <w:style w:type="character" w:styleId="EndnoteReference">
-    <w:name w:val="endnote reference"/>
-    <w:uiPriority w:val="99"/>
-    <w:semiHidden/>
-    <w:unhideWhenUsed/>
-    <w:rPr>
-      <w:vertAlign w:val="superscript"/>
-    </w:rPr>
-  </w:style>
-  <w:style w:type="paragraph" w:styleId="EndnoteText">
-    <w:name w:val="endnote text"/>
-    <w:link w:val="EndnoteTextChar"/>
-    <w:uiPriority w:val="99"/>
-    <w:semiHidden/>
-    <w:unhideWhenUsed/>
-    <w:rPr>
-      <w:sz w:val="20"/>
-      <w:szCs w:val="20"/>
-    </w:rPr>
-  </w:style>
-  <w:style w:type="character" w:customStyle="1" w:styleId="EndnoteTextChar">
-    <w:name w:val="Endnote Text Char"/>
-    <w:link w:val="EndnoteText"/>
-    <w:uiPriority w:val="99"/>
-    <w:semiHidden/>
-    <w:unhideWhenUsed/>
-    <w:rPr>
-      <w:sz w:val="20"/>
-      <w:szCs w:val="20"/>
-    </w:rPr>
-  </w:style>
-  <w:style w:type="paragraph" w:styleId="Header">
-    <w:name w:val="header"/>
-    <w:basedOn w:val="Normal"/>
-    <w:link w:val="HeaderChar"/>
-    <w:uiPriority w:val="99"/>
-    <w:unhideWhenUsed/>
-    <w:rsid w:val="00DE6616"/>
-    <w:pPr>
-      <w:tabs>
-        <w:tab w:val="center" w:pos="4513"/>
-        <w:tab w:val="right" w:pos="9026"/>
-      </w:tabs>
-    </w:pPr>
-  </w:style>
-  <w:style w:type="character" w:customStyle="1" w:styleId="HeaderChar">
-    <w:name w:val="Header Char"/>
-    <w:basedOn w:val="DefaultParagraphFont"/>
-    <w:link w:val="Header"/>
-    <w:uiPriority w:val="99"/>
-    <w:rsid w:val="00DE6616"/>
-  </w:style>
-  <w:style w:type="paragraph" w:styleId="Footer">
-    <w:name w:val="footer"/>
-    <w:basedOn w:val="Normal"/>
-    <w:link w:val="FooterChar"/>
-    <w:uiPriority w:val="99"/>
-    <w:unhideWhenUsed/>
-    <w:rsid w:val="00DE6616"/>
-    <w:pPr>
-      <w:tabs>
-        <w:tab w:val="center" w:pos="4513"/>
-        <w:tab w:val="right" w:pos="9026"/>
-      </w:tabs>
-    </w:pPr>
-  </w:style>
-  <w:style w:type="character" w:customStyle="1" w:styleId="FooterChar">
-    <w:name w:val="Footer Char"/>
-    <w:basedOn w:val="DefaultParagraphFont"/>
-    <w:link w:val="Footer"/>
-    <w:uiPriority w:val="99"/>
-    <w:rsid w:val="00DE6616"/>
   </w:style>
 </w:styles>
-</file>
-
-<file path=word/theme/theme1.xml><?xml version="1.0" encoding="utf-8"?>
-<a:theme xmlns:a="http://schemas.openxmlformats.org/drawingml/2006/main" name="Office Theme">
-  <a:themeElements>
-    <a:clrScheme name="Office">
-      <a:dk1>
-        <a:sysClr val="windowText" lastClr="000000"/>
-      </a:dk1>
-      <a:lt1>
-        <a:sysClr val="window" lastClr="FFFFFF"/>
-      </a:lt1>
-      <a:dk2>
-        <a:srgbClr val="0E2841"/>
-      </a:dk2>
-      <a:lt2>
-        <a:srgbClr val="E8E8E8"/>
-      </a:lt2>
-      <a:accent1>
-        <a:srgbClr val="156082"/>
-      </a:accent1>
-      <a:accent2>
-        <a:srgbClr val="E97132"/>
-      </a:accent2>
-      <a:accent3>
-        <a:srgbClr val="196B24"/>
-      </a:accent3>
-      <a:accent4>
-        <a:srgbClr val="0F9ED5"/>
-      </a:accent4>
-      <a:accent5>
-        <a:srgbClr val="A02B93"/>
-      </a:accent5>
-      <a:accent6>
-        <a:srgbClr val="4EA72E"/>
-      </a:accent6>
-      <a:hlink>
-        <a:srgbClr val="467886"/>
-      </a:hlink>
-      <a:folHlink>
-        <a:srgbClr val="96607D"/>
-      </a:folHlink>
-    </a:clrScheme>
-    <a:fontScheme name="Office">
-      <a:majorFont>
-        <a:latin typeface="Aptos Display" panose="02110004020202020204"/>
-        <a:ea typeface=""/>
-        <a:cs typeface=""/>
-        <a:font script="Jpan" typeface="游ゴシック Light"/>
-        <a:font script="Hang" typeface="맑은 고딕"/>
-        <a:font script="Hans" typeface="等线 Light"/>
-        <a:font script="Hant" typeface="新細明體"/>
-        <a:font script="Arab" typeface="Times New Roman"/>
-        <a:font script="Hebr" typeface="Times New Roman"/>
-        <a:font script="Thai" typeface="Angsana New"/>
-        <a:font script="Ethi" typeface="Nyala"/>
-        <a:font script="Beng" typeface="Vrinda"/>
-        <a:font script="Gujr" typeface="Shruti"/>
-        <a:font script="Khmr" typeface="MoolBoran"/>
-        <a:font script="Knda" typeface="Tunga"/>
-        <a:font script="Guru" typeface="Raavi"/>
-        <a:font script="Cans" typeface="Euphemia"/>
-        <a:font script="Cher" typeface="Plantagenet Cherokee"/>
-        <a:font script="Yiii" typeface="Microsoft Yi Baiti"/>
-        <a:font script="Tibt" typeface="Microsoft Himalaya"/>
-        <a:font script="Thaa" typeface="MV Boli"/>
-        <a:font script="Deva" typeface="Mangal"/>
-        <a:font script="Telu" typeface="Gautami"/>
-        <a:font script="Taml" typeface="Latha"/>
-        <a:font script="Syrc" typeface="Estrangelo Edessa"/>
-        <a:font script="Orya" typeface="Kalinga"/>
-        <a:font script="Mlym" typeface="Kartika"/>
-        <a:font script="Laoo" typeface="DokChampa"/>
-        <a:font script="Sinh" typeface="Iskoola Pota"/>
-        <a:font script="Mong" typeface="Mongolian Baiti"/>
-        <a:font script="Viet" typeface="Times New Roman"/>
-        <a:font script="Uigh" typeface="Microsoft Uighur"/>
-        <a:font script="Geor" typeface="Sylfaen"/>
-        <a:font script="Armn" typeface="Arial"/>
-        <a:font script="Bugi" typeface="Leelawadee UI"/>
-        <a:font script="Bopo" typeface="Microsoft JhengHei"/>
-        <a:font script="Java" typeface="Javanese Text"/>
-        <a:font script="Lisu" typeface="Segoe UI"/>
-        <a:font script="Mymr" typeface="Myanmar Text"/>
-        <a:font script="Nkoo" typeface="Ebrima"/>
-        <a:font script="Olck" typeface="Nirmala UI"/>
-        <a:font script="Osma" typeface="Ebrima"/>
-        <a:font script="Phag" typeface="Phagspa"/>
-        <a:font script="Syrn" typeface="Estrangelo Edessa"/>
-        <a:font script="Syrj" typeface="Estrangelo Edessa"/>
-        <a:font script="Syre" typeface="Estrangelo Edessa"/>
-        <a:font script="Sora" typeface="Nirmala UI"/>
-        <a:font script="Tale" typeface="Microsoft Tai Le"/>
-        <a:font script="Talu" typeface="Microsoft New Tai Lue"/>
-        <a:font script="Tfng" typeface="Ebrima"/>
-      </a:majorFont>
-      <a:minorFont>
-        <a:latin typeface="Aptos" panose="02110004020202020204"/>
-        <a:ea typeface=""/>
-        <a:cs typeface=""/>
-        <a:font script="Jpan" typeface="游明朝"/>
-        <a:font script="Hang" typeface="맑은 고딕"/>
-        <a:font script="Hans" typeface="等线"/>
-        <a:font script="Hant" typeface="新細明體"/>
-        <a:font script="Arab" typeface="Arial"/>
-        <a:font script="Hebr" typeface="Arial"/>
-        <a:font script="Thai" typeface="Cordia New"/>
-        <a:font script="Ethi" typeface="Nyala"/>
-        <a:font script="Beng" typeface="Vrinda"/>
-        <a:font script="Gujr" typeface="Shruti"/>
-        <a:font script="Khmr" typeface="DaunPenh"/>
-        <a:font script="Knda" typeface="Tunga"/>
-        <a:font script="Guru" typeface="Raavi"/>
-        <a:font script="Cans" typeface="Euphemia"/>
-        <a:font script="Cher" typeface="Plantagenet Cherokee"/>
-        <a:font script="Yiii" typeface="Microsoft Yi Baiti"/>
-        <a:font script="Tibt" typeface="Microsoft Himalaya"/>
-        <a:font script="Thaa" typeface="MV Boli"/>
-        <a:font script="Deva" typeface="Mangal"/>
-        <a:font script="Telu" typeface="Gautami"/>
-        <a:font script="Taml" typeface="Latha"/>
-        <a:font script="Syrc" typeface="Estrangelo Edessa"/>
-        <a:font script="Orya" typeface="Kalinga"/>
-        <a:font script="Mlym" typeface="Kartika"/>
-        <a:font script="Laoo" typeface="DokChampa"/>
-        <a:font script="Sinh" typeface="Iskoola Pota"/>
-        <a:font script="Mong" typeface="Mongolian Baiti"/>
-        <a:font script="Viet" typeface="Arial"/>
-        <a:font script="Uigh" typeface="Microsoft Uighur"/>
-        <a:font script="Geor" typeface="Sylfaen"/>
-        <a:font script="Armn" typeface="Arial"/>
-        <a:font script="Bugi" typeface="Leelawadee UI"/>
-        <a:font script="Bopo" typeface="Microsoft JhengHei"/>
-        <a:font script="Java" typeface="Javanese Text"/>
-        <a:font script="Lisu" typeface="Segoe UI"/>
-        <a:font script="Mymr" typeface="Myanmar Text"/>
-        <a:font script="Nkoo" typeface="Ebrima"/>
-        <a:font script="Olck" typeface="Nirmala UI"/>
-        <a:font script="Osma" typeface="Ebrima"/>
-        <a:font script="Phag" typeface="Phagspa"/>
-        <a:font script="Syrn" typeface="Estrangelo Edessa"/>
-        <a:font script="Syrj" typeface="Estrangelo Edessa"/>
-        <a:font script="Syre" typeface="Estrangelo Edessa"/>
-        <a:font script="Sora" typeface="Nirmala UI"/>
-        <a:font script="Tale" typeface="Microsoft Tai Le"/>
-        <a:font script="Talu" typeface="Microsoft New Tai Lue"/>
-        <a:font script="Tfng" typeface="Ebrima"/>
-      </a:minorFont>
-    </a:fontScheme>
-    <a:fmtScheme name="Office">
-      <a:fillStyleLst>
-        <a:solidFill>
-          <a:schemeClr val="phClr"/>
-        </a:solidFill>
-        <a:gradFill rotWithShape="1">
-          <a:gsLst>
-            <a:gs pos="0">
-              <a:schemeClr val="phClr">
-                <a:lumMod val="110000"/>
-                <a:satMod val="105000"/>
-                <a:tint val="67000"/>
-              </a:schemeClr>
-            </a:gs>
-            <a:gs pos="50000">
-              <a:schemeClr val="phClr">
-                <a:lumMod val="105000"/>
-                <a:satMod val="103000"/>
-                <a:tint val="73000"/>
-              </a:schemeClr>
-            </a:gs>
-            <a:gs pos="100000">
-              <a:schemeClr val="phClr">
-                <a:lumMod val="105000"/>
-                <a:satMod val="109000"/>
-                <a:tint val="81000"/>
-              </a:schemeClr>
-            </a:gs>
-          </a:gsLst>
-          <a:lin ang="5400000" scaled="0"/>
-        </a:gradFill>
-        <a:gradFill rotWithShape="1">
-          <a:gsLst>
-            <a:gs pos="0">
-              <a:schemeClr val="phClr">
-                <a:satMod val="103000"/>
-                <a:lumMod val="102000"/>
-                <a:tint val="94000"/>
-              </a:schemeClr>
-            </a:gs>
-            <a:gs pos="50000">
-              <a:schemeClr val="phClr">
-                <a:satMod val="110000"/>
-                <a:lumMod val="100000"/>
-                <a:shade val="100000"/>
-              </a:schemeClr>
-            </a:gs>
-            <a:gs pos="100000">
-              <a:schemeClr val="phClr">
-                <a:lumMod val="99000"/>
-                <a:satMod val="120000"/>
-                <a:shade val="78000"/>
-              </a:schemeClr>
-            </a:gs>
-          </a:gsLst>
-          <a:lin ang="5400000" scaled="0"/>
-        </a:gradFill>
-      </a:fillStyleLst>
-      <a:lnStyleLst>
-        <a:ln w="12700" cap="flat" cmpd="sng" algn="ctr">
-          <a:solidFill>
-            <a:schemeClr val="phClr"/>
-          </a:solidFill>
-          <a:prstDash val="solid"/>
-          <a:miter lim="800000"/>
-        </a:ln>
-        <a:ln w="19050" cap="flat" cmpd="sng" algn="ctr">
-          <a:solidFill>
-            <a:schemeClr val="phClr"/>
-          </a:solidFill>
-          <a:prstDash val="solid"/>
-          <a:miter lim="800000"/>
-        </a:ln>
-        <a:ln w="25400" cap="flat" cmpd="sng" algn="ctr">
-          <a:solidFill>
-            <a:schemeClr val="phClr"/>
-          </a:solidFill>
-          <a:prstDash val="solid"/>
-          <a:miter lim="800000"/>
-        </a:ln>
-      </a:lnStyleLst>
-      <a:effectStyleLst>
-        <a:effectStyle>
-          <a:effectLst/>
-        </a:effectStyle>
-        <a:effectStyle>
-          <a:effectLst/>
-        </a:effectStyle>
-        <a:effectStyle>
-          <a:effectLst>
-            <a:outerShdw blurRad="57150" dist="19050" dir="5400000" algn="ctr" rotWithShape="0">
-              <a:srgbClr val="000000">
-                <a:alpha val="63000"/>
-              </a:srgbClr>
-            </a:outerShdw>
-          </a:effectLst>
-        </a:effectStyle>
-      </a:effectStyleLst>
-      <a:bgFillStyleLst>
-        <a:solidFill>
-          <a:schemeClr val="phClr"/>
-        </a:solidFill>
-        <a:solidFill>
-          <a:schemeClr val="phClr">
-            <a:tint val="95000"/>
-            <a:satMod val="170000"/>
-          </a:schemeClr>
-        </a:solidFill>
-        <a:gradFill rotWithShape="1">
-          <a:gsLst>
-            <a:gs pos="0">
-              <a:schemeClr val="phClr">
-                <a:tint val="93000"/>
-                <a:satMod val="150000"/>
-                <a:shade val="98000"/>
-                <a:lumMod val="102000"/>
-              </a:schemeClr>
-            </a:gs>
-            <a:gs pos="50000">
-              <a:schemeClr val="phClr">
-                <a:tint val="98000"/>
-                <a:satMod val="130000"/>
-                <a:shade val="90000"/>
-                <a:lumMod val="103000"/>
-              </a:schemeClr>
-            </a:gs>
-            <a:gs pos="100000">
-              <a:schemeClr val="phClr">
-                <a:shade val="63000"/>
-                <a:satMod val="120000"/>
-              </a:schemeClr>
-            </a:gs>
-          </a:gsLst>
-          <a:lin ang="5400000" scaled="0"/>
-        </a:gradFill>
-      </a:bgFillStyleLst>
-    </a:fmtScheme>
-  </a:themeElements>
-  <a:objectDefaults>
-    <a:lnDef>
-      <a:spPr/>
-      <a:bodyPr/>
-      <a:lstStyle/>
-      <a:style>
-        <a:lnRef idx="2">
-          <a:schemeClr val="accent1"/>
-        </a:lnRef>
-        <a:fillRef idx="0">
-          <a:schemeClr val="accent1"/>
-        </a:fillRef>
-        <a:effectRef idx="1">
-          <a:schemeClr val="accent1"/>
-        </a:effectRef>
-        <a:fontRef idx="minor">
-          <a:schemeClr val="tx1"/>
-        </a:fontRef>
-      </a:style>
-    </a:lnDef>
-  </a:objectDefaults>
-  <a:extraClrSchemeLst/>
-  <a:extLst>
-    <a:ext uri="{05A4C25C-085E-4340-85A3-A5531E510DB2}">
-      <thm15:themeFamily xmlns:thm15="http://schemas.microsoft.com/office/thememl/2012/main" name="Office Theme" id="{2E142A2C-CD16-42D6-873A-C26D2A0506FA}" vid="{1BDDFF52-6CD6-40A5-AB3C-68EB2F1E4D0A}"/>
-    </a:ext>
-  </a:extLst>
-</a:theme>
 </file>
</xml_diff>